<commit_message>
state: 2026-09-28T18:45:14Z run 86
</commit_message>
<xml_diff>
--- a/reports/PatchTimeline.docx
+++ b/reports/PatchTimeline.docx
@@ -18,7 +18,7 @@
         <w:rPr>
           <w:color w:val="666666"/>
         </w:rPr>
-        <w:t xml:space="preserve">Generated 28 September 2026 16:42 UTC  |  10 entries recorded</w:t>
+        <w:t xml:space="preserve">Generated 28 September 2026 18:45 UTC  |  11 entries recorded</w:t>
       </w:r>
     </w:p>
     <w:p>
@@ -122,7 +122,7 @@
               <w:spacing w:before="40" w:after="40"/>
             </w:pPr>
             <w:r>
-              <w:t xml:space="preserve">10</w:t>
+              <w:t xml:space="preserve">11</w:t>
             </w:r>
           </w:p>
         </w:tc>
@@ -225,7 +225,7 @@
               <w:spacing w:before="40" w:after="40"/>
             </w:pPr>
             <w:r>
-              <w:t xml:space="preserve">2</w:t>
+              <w:t xml:space="preserve">3</w:t>
             </w:r>
           </w:p>
         </w:tc>
@@ -291,7 +291,7 @@
               <w:spacing w:before="40" w:after="40"/>
             </w:pPr>
             <w:r>
-              <w:t xml:space="preserve">2</w:t>
+              <w:t xml:space="preserve">3</w:t>
             </w:r>
           </w:p>
         </w:tc>
@@ -375,6 +375,262 @@
       <w:r>
         <w:t xml:space="preserve">Timeline</w:t>
       </w:r>
+    </w:p>
+    <w:p>
+      <w:pPr>
+        <w:pStyle w:val="Heading2"/>
+      </w:pPr>
+      <w:r>
+        <w:t xml:space="preserve">Monday, 28 September 2026</w:t>
+      </w:r>
+    </w:p>
+    <w:p>
+      <w:pPr>
+        <w:pStyle w:val="Meta"/>
+      </w:pPr>
+      <w:r>
+        <w:rPr>
+          <w:color w:val="666666"/>
+        </w:rPr>
+        <w:t xml:space="preserve">1 release recorded</w:t>
+      </w:r>
+    </w:p>
+    <w:p>
+      <w:pPr>
+        <w:pStyle w:val="Heading3"/>
+      </w:pPr>
+      <w:r>
+        <w:rPr>
+          <w:b/>
+        </w:rPr>
+        <w:t xml:space="preserve">iOS and iPadOS 26.7.1</w:t>
+      </w:r>
+      <w:r>
+        <w:t xml:space="preserve">   </w:t>
+      </w:r>
+      <w:r>
+        <w:rPr>
+          <w:b/>
+          <w:color w:val="525252"/>
+        </w:rPr>
+        <w:t xml:space="preserve">[UNKNOWN]</w:t>
+      </w:r>
+    </w:p>
+    <w:p>
+      <w:pPr>
+        <w:pStyle w:val="Meta"/>
+      </w:pPr>
+      <w:r>
+        <w:t xml:space="preserve">ios  |  released 2026-09-28  |  1 CVEs</w:t>
+      </w:r>
+      <w:r>
+        <w:t xml:space="preserve"/>
+      </w:r>
+      <w:r>
+        <w:t xml:space="preserve"/>
+      </w:r>
+    </w:p>
+    <w:p>
+      <w:r>
+        <w:rPr>
+          <w:i/>
+          <w:color w:val="8B0000"/>
+        </w:rPr>
+        <w:t xml:space="preserve">Automated analysis was rejected by the validator; Intune mapping needs manual review.</w:t>
+      </w:r>
+    </w:p>
+    <w:p>
+      <w:r>
+        <w:t xml:space="preserve">iOS and iPadOS 26.7.1 was published on 2026-09-28 and addresses 1 CVEs (1 UNKNOWN). Highest severity: UNKNOWN.
+AUTOMATED ANALYSIS UNAVAILABLE - ANTHROPIC_API_KEY is not set. Intune configuration requires manual review against https://support.apple.com/en-us/149226.</w:t>
+      </w:r>
+    </w:p>
+    <w:tbl>
+      <w:tblPr>
+        <w:tblW w:w="10050" w:type="dxa"/>
+        <w:tblBorders>
+          <w:top w:val="single" w:sz="4" w:color="dddddd"/>
+          <w:left w:val="none" w:sz="0" w:color="auto"/>
+          <w:bottom w:val="single" w:sz="4" w:color="dddddd"/>
+          <w:right w:val="none" w:sz="0" w:color="auto"/>
+          <w:insideH w:val="single" w:sz="4" w:color="eeeeee"/>
+          <w:insideV w:val="none" w:sz="0" w:color="auto"/>
+        </w:tblBorders>
+      </w:tblPr>
+      <w:tblGrid>
+        <w:gridCol w:w="1150"/>
+        <w:gridCol w:w="2350"/>
+        <w:gridCol w:w="2250"/>
+        <w:gridCol w:w="4300"/>
+      </w:tblGrid>
+      <w:tr>
+        <w:trPr>
+          <w:cantSplit/>
+          <w:tblHeader/>
+        </w:trPr>
+        <w:tc>
+          <w:tcPr>
+            <w:tcW w:w="1150" w:type="dxa"/>
+            <w:vAlign w:val="center"/>
+          </w:tcPr>
+          <w:p>
+            <w:pPr>
+              <w:spacing w:before="40" w:after="40"/>
+            </w:pPr>
+            <w:r>
+              <w:rPr>
+                <w:b/>
+              </w:rPr>
+              <w:t xml:space="preserve">Severity</w:t>
+            </w:r>
+          </w:p>
+        </w:tc>
+        <w:tc>
+          <w:tcPr>
+            <w:tcW w:w="2350" w:type="dxa"/>
+            <w:vAlign w:val="center"/>
+          </w:tcPr>
+          <w:p>
+            <w:pPr>
+              <w:spacing w:before="40" w:after="40"/>
+            </w:pPr>
+            <w:r>
+              <w:rPr>
+                <w:b/>
+              </w:rPr>
+              <w:t xml:space="preserve">CVE</w:t>
+            </w:r>
+          </w:p>
+        </w:tc>
+        <w:tc>
+          <w:tcPr>
+            <w:tcW w:w="2250" w:type="dxa"/>
+            <w:vAlign w:val="center"/>
+          </w:tcPr>
+          <w:p>
+            <w:pPr>
+              <w:spacing w:before="40" w:after="40"/>
+            </w:pPr>
+            <w:r>
+              <w:rPr>
+                <w:b/>
+              </w:rPr>
+              <w:t xml:space="preserve">Component</w:t>
+            </w:r>
+          </w:p>
+        </w:tc>
+        <w:tc>
+          <w:tcPr>
+            <w:tcW w:w="4300" w:type="dxa"/>
+            <w:vAlign w:val="center"/>
+          </w:tcPr>
+          <w:p>
+            <w:pPr>
+              <w:spacing w:before="40" w:after="40"/>
+            </w:pPr>
+            <w:r>
+              <w:rPr>
+                <w:b/>
+              </w:rPr>
+              <w:t xml:space="preserve">Basis</w:t>
+            </w:r>
+          </w:p>
+        </w:tc>
+      </w:tr>
+      <w:tr>
+        <w:trPr>
+          <w:cantSplit/>
+        </w:trPr>
+        <w:tc>
+          <w:tcPr>
+            <w:tcW w:w="1150" w:type="dxa"/>
+            <w:shd w:val="clear" w:color="auto" w:fill="F5F5F5"/>
+            <w:vAlign w:val="center"/>
+          </w:tcPr>
+          <w:p>
+            <w:pPr>
+              <w:spacing w:before="40" w:after="40"/>
+            </w:pPr>
+            <w:r>
+              <w:rPr>
+                <w:b/>
+                <w:color w:val="525252"/>
+              </w:rPr>
+              <w:t xml:space="preserve">UNKNOWN</w:t>
+            </w:r>
+          </w:p>
+        </w:tc>
+        <w:tc>
+          <w:tcPr>
+            <w:tcW w:w="2350" w:type="dxa"/>
+            <w:vAlign w:val="center"/>
+          </w:tcPr>
+          <w:p>
+            <w:pPr>
+              <w:spacing w:before="40" w:after="40"/>
+            </w:pPr>
+            <w:r>
+              <w:rPr>
+                <w:rFonts w:ascii="Consolas" w:hAnsi="Consolas"/>
+              </w:rPr>
+              <w:t xml:space="preserve">CVE-2026-86950</w:t>
+            </w:r>
+          </w:p>
+        </w:tc>
+        <w:tc>
+          <w:tcPr>
+            <w:tcW w:w="2250" w:type="dxa"/>
+            <w:vAlign w:val="center"/>
+          </w:tcPr>
+          <w:p>
+            <w:pPr>
+              <w:spacing w:before="40" w:after="40"/>
+            </w:pPr>
+            <w:r>
+              <w:t xml:space="preserve">-</w:t>
+            </w:r>
+          </w:p>
+        </w:tc>
+        <w:tc>
+          <w:tcPr>
+            <w:tcW w:w="4300" w:type="dxa"/>
+            <w:vAlign w:val="center"/>
+          </w:tcPr>
+          <w:p>
+            <w:pPr>
+              <w:spacing w:before="40" w:after="40"/>
+            </w:pPr>
+            <w:r>
+              <w:rPr>
+                <w:color w:val="666666"/>
+                <w:sz w:val="16"/>
+              </w:rPr>
+              <w:t xml:space="preserve">no severity signal from any source - requires manual triage</w:t>
+            </w:r>
+          </w:p>
+        </w:tc>
+      </w:tr>
+    </w:tbl>
+    <w:p>
+      <w:pPr>
+        <w:spacing w:after="0"/>
+      </w:pPr>
+    </w:p>
+    <w:p>
+      <w:r>
+        <w:rPr>
+          <w:color w:val="1155CC"/>
+          <w:sz w:val="16"/>
+        </w:rPr>
+        <w:t xml:space="preserve">https://support.apple.com/en-us/149226</w:t>
+      </w:r>
+    </w:p>
+    <w:p>
+      <w:pPr>
+        <w:pBdr>
+          <w:bottom w:val="single" w:sz="6" w:space="2" w:color="d0d0d0"/>
+        </w:pBdr>
+      </w:pPr>
     </w:p>
     <w:p>
       <w:pPr>

</xml_diff>